<commit_message>
Update man hinh bao hong cua manager, le tan, don dep
</commit_message>
<xml_diff>
--- a/docs/THAY_DOI_BR.docx
+++ b/docs/THAY_DOI_BR.docx
@@ -25,7 +25,7 @@
         <w:rPr>
           <w:color w:val="5B6472"/>
         </w:rPr>
-        <w:t xml:space="preserve">Hệ thống quản lý vận hành khách sạn (SaaS đa tenant) — Milestone 1 · Cập nhật 25/09/2026</w:t>
+        <w:t xml:space="preserve">Hệ thống quản lý vận hành khách sạn (SaaS đa tenant) — Milestone 1 · Cập nhật 02/10/2026</w:t>
       </w:r>
     </w:p>
     <w:p>
@@ -1506,6 +1506,360 @@
           </w:p>
         </w:tc>
       </w:tr>
+      <w:tr>
+        <w:tc>
+          <w:tcPr>
+            <w:tcW w:type="dxa" w:w="1350"/>
+            <w:tcBorders>
+              <w:top w:val="single" w:color="BFC5CD" w:sz="4"/>
+              <w:left w:val="single" w:color="BFC5CD" w:sz="4"/>
+              <w:bottom w:val="single" w:color="BFC5CD" w:sz="4"/>
+              <w:right w:val="single" w:color="BFC5CD" w:sz="4"/>
+            </w:tcBorders>
+            <w:tcMar>
+              <w:top w:type="dxa" w:w="70"/>
+              <w:left w:type="dxa" w:w="110"/>
+              <w:bottom w:type="dxa" w:w="70"/>
+              <w:right w:type="dxa" w:w="110"/>
+            </w:tcMar>
+          </w:tcPr>
+          <w:p>
+            <w:pPr>
+              <w:spacing w:after="40"/>
+            </w:pPr>
+            <w:r>
+              <w:t xml:space="preserve">BR-ASSET-11</w:t>
+            </w:r>
+          </w:p>
+        </w:tc>
+        <w:tc>
+          <w:tcPr>
+            <w:tcW w:type="dxa" w:w="2650"/>
+            <w:tcBorders>
+              <w:top w:val="single" w:color="BFC5CD" w:sz="4"/>
+              <w:left w:val="single" w:color="BFC5CD" w:sz="4"/>
+              <w:bottom w:val="single" w:color="BFC5CD" w:sz="4"/>
+              <w:right w:val="single" w:color="BFC5CD" w:sz="4"/>
+            </w:tcBorders>
+            <w:tcMar>
+              <w:top w:type="dxa" w:w="70"/>
+              <w:left w:type="dxa" w:w="110"/>
+              <w:bottom w:type="dxa" w:w="70"/>
+              <w:right w:type="dxa" w:w="110"/>
+            </w:tcMar>
+          </w:tcPr>
+          <w:p>
+            <w:pPr>
+              <w:spacing w:after="40"/>
+            </w:pPr>
+            <w:r>
+              <w:t xml:space="preserve">Báo hỏng có 2 trạng thái Mới / Đã xử lý; không nói gì về nội dung xử lý.</w:t>
+            </w:r>
+          </w:p>
+        </w:tc>
+        <w:tc>
+          <w:tcPr>
+            <w:tcW w:type="dxa" w:w="3638"/>
+            <w:tcBorders>
+              <w:top w:val="single" w:color="BFC5CD" w:sz="4"/>
+              <w:left w:val="single" w:color="BFC5CD" w:sz="4"/>
+              <w:bottom w:val="single" w:color="BFC5CD" w:sz="4"/>
+              <w:right w:val="single" w:color="BFC5CD" w:sz="4"/>
+            </w:tcBorders>
+            <w:tcMar>
+              <w:top w:type="dxa" w:w="70"/>
+              <w:left w:type="dxa" w:w="110"/>
+              <w:bottom w:type="dxa" w:w="70"/>
+              <w:right w:type="dxa" w:w="110"/>
+            </w:tcMar>
+          </w:tcPr>
+          <w:p>
+            <w:pPr>
+              <w:spacing w:after="40"/>
+            </w:pPr>
+            <w:r>
+              <w:t xml:space="preserve">Giữ nguyên 2 trạng thái. Bổ sung "Ghi chú xử lý" (không bắt buộc, tối đa 500 ký tự) Manager nhập khi đóng phiếu.</w:t>
+            </w:r>
+          </w:p>
+          <w:p>
+            <w:pPr>
+              <w:spacing w:after="40"/>
+            </w:pPr>
+            <w:r>
+              <w:t xml:space="preserve">Nhân viên báo hỏng thấy ghi chú và người xử lý ở màn "Báo hỏng của tôi".</w:t>
+            </w:r>
+          </w:p>
+          <w:p>
+            <w:pPr>
+              <w:spacing w:after="40"/>
+            </w:pPr>
+            <w:r>
+              <w:t xml:space="preserve">Phiếu đã đóng thì không đóng lại được (báo lỗi, không lặng lẽ bỏ qua).</w:t>
+            </w:r>
+          </w:p>
+        </w:tc>
+        <w:tc>
+          <w:tcPr>
+            <w:tcW w:type="dxa" w:w="2000"/>
+            <w:tcBorders>
+              <w:top w:val="single" w:color="BFC5CD" w:sz="4"/>
+              <w:left w:val="single" w:color="BFC5CD" w:sz="4"/>
+              <w:bottom w:val="single" w:color="BFC5CD" w:sz="4"/>
+              <w:right w:val="single" w:color="BFC5CD" w:sz="4"/>
+            </w:tcBorders>
+            <w:tcMar>
+              <w:top w:type="dxa" w:w="70"/>
+              <w:left w:type="dxa" w:w="110"/>
+              <w:bottom w:type="dxa" w:w="70"/>
+              <w:right w:type="dxa" w:w="110"/>
+            </w:tcMar>
+          </w:tcPr>
+          <w:p>
+            <w:pPr>
+              <w:spacing w:after="40"/>
+            </w:pPr>
+            <w:r>
+              <w:t xml:space="preserve">Migration V3__damage_report_resolution_note.sql (cột damage_reports.resolution_note); PATCH /assets/damage-reports/{id}/resolve.</w:t>
+            </w:r>
+          </w:p>
+        </w:tc>
+      </w:tr>
+      <w:tr>
+        <w:tc>
+          <w:tcPr>
+            <w:tcW w:type="dxa" w:w="1350"/>
+            <w:tcBorders>
+              <w:top w:val="single" w:color="BFC5CD" w:sz="4"/>
+              <w:left w:val="single" w:color="BFC5CD" w:sz="4"/>
+              <w:bottom w:val="single" w:color="BFC5CD" w:sz="4"/>
+              <w:right w:val="single" w:color="BFC5CD" w:sz="4"/>
+            </w:tcBorders>
+            <w:tcMar>
+              <w:top w:type="dxa" w:w="70"/>
+              <w:left w:type="dxa" w:w="110"/>
+              <w:bottom w:type="dxa" w:w="70"/>
+              <w:right w:type="dxa" w:w="110"/>
+            </w:tcMar>
+          </w:tcPr>
+          <w:p>
+            <w:pPr>
+              <w:spacing w:after="40"/>
+            </w:pPr>
+            <w:r>
+              <w:t xml:space="preserve">BR-ASSET-06</w:t>
+            </w:r>
+          </w:p>
+        </w:tc>
+        <w:tc>
+          <w:tcPr>
+            <w:tcW w:type="dxa" w:w="2650"/>
+            <w:tcBorders>
+              <w:top w:val="single" w:color="BFC5CD" w:sz="4"/>
+              <w:left w:val="single" w:color="BFC5CD" w:sz="4"/>
+              <w:bottom w:val="single" w:color="BFC5CD" w:sz="4"/>
+              <w:right w:val="single" w:color="BFC5CD" w:sz="4"/>
+            </w:tcBorders>
+            <w:tcMar>
+              <w:top w:type="dxa" w:w="70"/>
+              <w:left w:type="dxa" w:w="110"/>
+              <w:bottom w:type="dxa" w:w="70"/>
+              <w:right w:type="dxa" w:w="110"/>
+            </w:tcMar>
+          </w:tcPr>
+          <w:p>
+            <w:pPr>
+              <w:spacing w:after="40"/>
+            </w:pPr>
+            <w:r>
+              <w:t xml:space="preserve">Báo hỏng không tự đổi trạng thái tài sản/phòng; Manager tự xem và tự quyết định.</w:t>
+            </w:r>
+          </w:p>
+        </w:tc>
+        <w:tc>
+          <w:tcPr>
+            <w:tcW w:type="dxa" w:w="3638"/>
+            <w:tcBorders>
+              <w:top w:val="single" w:color="BFC5CD" w:sz="4"/>
+              <w:left w:val="single" w:color="BFC5CD" w:sz="4"/>
+              <w:bottom w:val="single" w:color="BFC5CD" w:sz="4"/>
+              <w:right w:val="single" w:color="BFC5CD" w:sz="4"/>
+            </w:tcBorders>
+            <w:tcMar>
+              <w:top w:type="dxa" w:w="70"/>
+              <w:left w:type="dxa" w:w="110"/>
+              <w:bottom w:type="dxa" w:w="70"/>
+              <w:right w:type="dxa" w:w="110"/>
+            </w:tcMar>
+          </w:tcPr>
+          <w:p>
+            <w:pPr>
+              <w:spacing w:after="40"/>
+            </w:pPr>
+            <w:r>
+              <w:t xml:space="preserve">Giữ nguyên: tạo báo hỏng không đổi gì. Làm rõ: khi đóng phiếu, Manager được CHỌN trạng thái mới cho tài sản (Tốt / Hỏng / Đang sửa / Thanh lý) hoặc giữ nguyên.</w:t>
+            </w:r>
+          </w:p>
+          <w:p>
+            <w:pPr>
+              <w:spacing w:after="40"/>
+            </w:pPr>
+            <w:r>
+              <w:t xml:space="preserve">Đóng phiếu và đổi trạng thái tài sản chạy trong cùng một giao dịch: lỗi bước nào thì cả hai cùng giữ nguyên.</w:t>
+            </w:r>
+          </w:p>
+          <w:p>
+            <w:pPr>
+              <w:spacing w:after="40"/>
+            </w:pPr>
+            <w:r>
+              <w:t xml:space="preserve">Chọn Thanh lý thì mọi báo hỏng khác đang chờ của tài sản đó tự đóng (luật cũ của BR-ASSET-14).</w:t>
+            </w:r>
+          </w:p>
+          <w:p>
+            <w:pPr>
+              <w:spacing w:after="40"/>
+            </w:pPr>
+            <w:r>
+              <w:t xml:space="preserve">Trạng thái phòng không bao giờ bị đụng tới; cần khóa phòng thì Manager chuyển "Không khả dụng" ở màn phòng.</w:t>
+            </w:r>
+          </w:p>
+        </w:tc>
+        <w:tc>
+          <w:tcPr>
+            <w:tcW w:type="dxa" w:w="2000"/>
+            <w:tcBorders>
+              <w:top w:val="single" w:color="BFC5CD" w:sz="4"/>
+              <w:left w:val="single" w:color="BFC5CD" w:sz="4"/>
+              <w:bottom w:val="single" w:color="BFC5CD" w:sz="4"/>
+              <w:right w:val="single" w:color="BFC5CD" w:sz="4"/>
+            </w:tcBorders>
+            <w:tcMar>
+              <w:top w:type="dxa" w:w="70"/>
+              <w:left w:type="dxa" w:w="110"/>
+              <w:bottom w:type="dxa" w:w="70"/>
+              <w:right w:type="dxa" w:w="110"/>
+            </w:tcMar>
+          </w:tcPr>
+          <w:p>
+            <w:pPr>
+              <w:spacing w:after="40"/>
+            </w:pPr>
+            <w:r>
+              <w:t xml:space="preserve">ResolveDamageReportRequest (newAssetStatus, resolutionNote — đều không bắt buộc); DamageReportService.resolveDamageReport.</w:t>
+            </w:r>
+          </w:p>
+        </w:tc>
+      </w:tr>
+      <w:tr>
+        <w:tc>
+          <w:tcPr>
+            <w:tcW w:type="dxa" w:w="1350"/>
+            <w:tcBorders>
+              <w:top w:val="single" w:color="BFC5CD" w:sz="4"/>
+              <w:left w:val="single" w:color="BFC5CD" w:sz="4"/>
+              <w:bottom w:val="single" w:color="BFC5CD" w:sz="4"/>
+              <w:right w:val="single" w:color="BFC5CD" w:sz="4"/>
+            </w:tcBorders>
+            <w:tcMar>
+              <w:top w:type="dxa" w:w="70"/>
+              <w:left w:type="dxa" w:w="110"/>
+              <w:bottom w:type="dxa" w:w="70"/>
+              <w:right w:type="dxa" w:w="110"/>
+            </w:tcMar>
+          </w:tcPr>
+          <w:p>
+            <w:pPr>
+              <w:spacing w:after="40"/>
+            </w:pPr>
+            <w:r>
+              <w:t xml:space="preserve">BR-ASSET-05, BR-PERM-03</w:t>
+            </w:r>
+          </w:p>
+        </w:tc>
+        <w:tc>
+          <w:tcPr>
+            <w:tcW w:type="dxa" w:w="2650"/>
+            <w:tcBorders>
+              <w:top w:val="single" w:color="BFC5CD" w:sz="4"/>
+              <w:left w:val="single" w:color="BFC5CD" w:sz="4"/>
+              <w:bottom w:val="single" w:color="BFC5CD" w:sz="4"/>
+              <w:right w:val="single" w:color="BFC5CD" w:sz="4"/>
+            </w:tcBorders>
+            <w:tcMar>
+              <w:top w:type="dxa" w:w="70"/>
+              <w:left w:type="dxa" w:w="110"/>
+              <w:bottom w:type="dxa" w:w="70"/>
+              <w:right w:type="dxa" w:w="110"/>
+            </w:tcMar>
+          </w:tcPr>
+          <w:p>
+            <w:pPr>
+              <w:spacing w:after="40"/>
+            </w:pPr>
+            <w:r>
+              <w:t xml:space="preserve">Lễ tân và Dọn dẹp có quyền báo hỏng. Code cũ cho cả Manager và Admin gọi API tạo báo hỏng.</w:t>
+            </w:r>
+          </w:p>
+        </w:tc>
+        <w:tc>
+          <w:tcPr>
+            <w:tcW w:type="dxa" w:w="3638"/>
+            <w:tcBorders>
+              <w:top w:val="single" w:color="BFC5CD" w:sz="4"/>
+              <w:left w:val="single" w:color="BFC5CD" w:sz="4"/>
+              <w:bottom w:val="single" w:color="BFC5CD" w:sz="4"/>
+              <w:right w:val="single" w:color="BFC5CD" w:sz="4"/>
+            </w:tcBorders>
+            <w:tcMar>
+              <w:top w:type="dxa" w:w="70"/>
+              <w:left w:type="dxa" w:w="110"/>
+              <w:bottom w:type="dxa" w:w="70"/>
+              <w:right w:type="dxa" w:w="110"/>
+            </w:tcMar>
+          </w:tcPr>
+          <w:p>
+            <w:pPr>
+              <w:spacing w:after="40"/>
+            </w:pPr>
+            <w:r>
+              <w:t xml:space="preserve">Chỉ nhân viên có quyền Lễ tân hoặc Dọn dẹp tạo báo hỏng. Manager là người nhận báo hỏng nên không tạo; thấy tài sản hỏng thì đổi trạng thái thẳng.</w:t>
+            </w:r>
+          </w:p>
+          <w:p>
+            <w:pPr>
+              <w:spacing w:after="40"/>
+            </w:pPr>
+            <w:r>
+              <w:t xml:space="preserve">Nơi báo: tab "Tài sản trong phòng" ở chi tiết phòng (tài sản gắn Phòng) và khối "Tài sản khu vực" ở màn "Báo hỏng của tôi" (tài sản gắn Khu vực).</w:t>
+            </w:r>
+          </w:p>
+        </w:tc>
+        <w:tc>
+          <w:tcPr>
+            <w:tcW w:type="dxa" w:w="2000"/>
+            <w:tcBorders>
+              <w:top w:val="single" w:color="BFC5CD" w:sz="4"/>
+              <w:left w:val="single" w:color="BFC5CD" w:sz="4"/>
+              <w:bottom w:val="single" w:color="BFC5CD" w:sz="4"/>
+              <w:right w:val="single" w:color="BFC5CD" w:sz="4"/>
+            </w:tcBorders>
+            <w:tcMar>
+              <w:top w:type="dxa" w:w="70"/>
+              <w:left w:type="dxa" w:w="110"/>
+              <w:bottom w:type="dxa" w:w="70"/>
+              <w:right w:type="dxa" w:w="110"/>
+            </w:tcMar>
+          </w:tcPr>
+          <w:p>
+            <w:pPr>
+              <w:spacing w:after="40"/>
+            </w:pPr>
+            <w:r>
+              <w:t xml:space="preserve">SecurityConfig (POST /assets/damage-reports); RoomAssetsPanel, MyDamageReportsPage (/bao-hong/cua-toi).</w:t>
+            </w:r>
+          </w:p>
+        </w:tc>
+      </w:tr>
     </w:tbl>
     <w:p>
       <w:pPr>
@@ -2913,6 +3267,19 @@
       </w:pPr>
       <w:r>
         <w:t xml:space="preserve">Không còn bảng user_extra_positions (bản kiêm nhiệm cũ đã bỏ). Cột locations.timezone vẫn còn nhưng luôn là Asia/Ho_Chi_Minh.</w:t>
+      </w:r>
+    </w:p>
+    <w:p>
+      <w:pPr>
+        <w:pStyle w:val="ListParagraph"/>
+        <w:numPr>
+          <w:ilvl w:val="0"/>
+          <w:numId w:val="2"/>
+        </w:numPr>
+        <w:spacing w:after="60"/>
+      </w:pPr>
+      <w:r>
+        <w:t xml:space="preserve">Bảng damage_reports thêm cột resolution_note VARCHAR(500) NULL (ghi chú xử lý của Manager, migration V3).</w:t>
       </w:r>
     </w:p>
     <w:p>

</xml_diff>